<commit_message>
📚 docs(mobile): add hover and grid to av2
Co-Authored-By: Claude Opus 5.5 <noreply@anthropic.com>
</commit_message>
<xml_diff>
--- a/docs/av2-oncomente.docx
+++ b/docs/av2-oncomente.docx
@@ -43,7 +43,7 @@
           <w:sz w:val="16"/>
           <w:szCs w:val="16"/>
         </w:rPr>
-        <w:t xml:space="preserve">Branch ux-av2 · v1 = commit 92e5d3c (tag ux-av2-v1) · v2 = commit a11b51d (tag ux-av2-v2) · v3 (atual) = commit 6cf7d36 (tag ux-av2-v3)</w:t>
+        <w:t xml:space="preserve">Branch ux-av2 · v1 = commit 92e5d3c (tag ux-av2-v1) · v2 = commit a11b51d (tag ux-av2-v2) · v3 (atual) = commit b9d858a (tag ux-av2-v3)</w:t>
       </w:r>
     </w:p>
     <w:p>
@@ -2703,6 +2703,789 @@
         <w:rPr>
           <w:rFonts w:ascii="Calibri" w:cs="Calibri" w:eastAsia="Calibri" w:hAnsi="Calibri"/>
         </w:rPr>
+        <w:t xml:space="preserve">Grid e layout</w:t>
+      </w:r>
+    </w:p>
+    <w:p>
+      <w:pPr>
+        <w:spacing w:after="100" w:line="264"/>
+      </w:pPr>
+      <w:r>
+        <w:rPr>
+          <w:rFonts w:ascii="Calibri" w:cs="Calibri" w:eastAsia="Calibri" w:hAnsi="Calibri"/>
+          <w:sz w:val="19"/>
+          <w:szCs w:val="19"/>
+        </w:rPr>
+        <w:t xml:space="preserve">Layout de coluna única para celular, construído sobre a escala de espaçamento de 8. As medidas estruturais ficam em layout.* (tokens.ts).</w:t>
+      </w:r>
+    </w:p>
+    <w:tbl>
+      <w:tblPr>
+        <w:tblW w:type="dxa" w:w="10204"/>
+        <w:tblBorders>
+          <w:top w:val="single" w:color="auto" w:sz="4"/>
+          <w:left w:val="single" w:color="auto" w:sz="4"/>
+          <w:bottom w:val="single" w:color="auto" w:sz="4"/>
+          <w:right w:val="single" w:color="auto" w:sz="4"/>
+          <w:insideH w:val="single" w:color="auto" w:sz="4"/>
+          <w:insideV w:val="single" w:color="auto" w:sz="4"/>
+        </w:tblBorders>
+      </w:tblPr>
+      <w:tblGrid>
+        <w:gridCol w:w="2448"/>
+        <w:gridCol w:w="4693"/>
+        <w:gridCol w:w="3063"/>
+      </w:tblGrid>
+      <w:tr>
+        <w:trPr>
+          <w:cantSplit/>
+          <w:tblHeader/>
+        </w:trPr>
+        <w:tc>
+          <w:tcPr>
+            <w:tcW w:type="dxa" w:w="2448"/>
+            <w:tcBorders>
+              <w:top w:val="single" w:color="C8C8D0" w:sz="4"/>
+              <w:left w:val="single" w:color="C8C8D0" w:sz="4"/>
+              <w:bottom w:val="single" w:color="C8C8D0" w:sz="4"/>
+              <w:right w:val="single" w:color="C8C8D0" w:sz="4"/>
+            </w:tcBorders>
+            <w:shd w:fill="EEE3FB" w:color="auto" w:val="clear"/>
+            <w:tcMar>
+              <w:top w:type="dxa" w:w="40"/>
+              <w:left w:type="dxa" w:w="80"/>
+              <w:bottom w:type="dxa" w:w="40"/>
+              <w:right w:type="dxa" w:w="80"/>
+            </w:tcMar>
+            <w:vAlign w:val="top"/>
+          </w:tcPr>
+          <w:p>
+            <w:pPr>
+              <w:spacing w:after="0" w:line="240"/>
+            </w:pPr>
+            <w:r>
+              <w:rPr>
+                <w:rFonts w:ascii="Calibri" w:cs="Calibri" w:eastAsia="Calibri" w:hAnsi="Calibri"/>
+                <w:b/>
+                <w:bCs/>
+                <w:color w:val="5B2E99"/>
+                <w:sz w:val="16"/>
+                <w:szCs w:val="16"/>
+              </w:rPr>
+              <w:t xml:space="preserve">Elemento</w:t>
+            </w:r>
+          </w:p>
+        </w:tc>
+        <w:tc>
+          <w:tcPr>
+            <w:tcW w:type="dxa" w:w="4693"/>
+            <w:tcBorders>
+              <w:top w:val="single" w:color="C8C8D0" w:sz="4"/>
+              <w:left w:val="single" w:color="C8C8D0" w:sz="4"/>
+              <w:bottom w:val="single" w:color="C8C8D0" w:sz="4"/>
+              <w:right w:val="single" w:color="C8C8D0" w:sz="4"/>
+            </w:tcBorders>
+            <w:shd w:fill="EEE3FB" w:color="auto" w:val="clear"/>
+            <w:tcMar>
+              <w:top w:type="dxa" w:w="40"/>
+              <w:left w:type="dxa" w:w="80"/>
+              <w:bottom w:type="dxa" w:w="40"/>
+              <w:right w:type="dxa" w:w="80"/>
+            </w:tcMar>
+            <w:vAlign w:val="top"/>
+          </w:tcPr>
+          <w:p>
+            <w:pPr>
+              <w:spacing w:after="0" w:line="240"/>
+            </w:pPr>
+            <w:r>
+              <w:rPr>
+                <w:rFonts w:ascii="Calibri" w:cs="Calibri" w:eastAsia="Calibri" w:hAnsi="Calibri"/>
+                <w:b/>
+                <w:bCs/>
+                <w:color w:val="5B2E99"/>
+                <w:sz w:val="16"/>
+                <w:szCs w:val="16"/>
+              </w:rPr>
+              <w:t xml:space="preserve">Regra</w:t>
+            </w:r>
+          </w:p>
+        </w:tc>
+        <w:tc>
+          <w:tcPr>
+            <w:tcW w:type="dxa" w:w="3063"/>
+            <w:tcBorders>
+              <w:top w:val="single" w:color="C8C8D0" w:sz="4"/>
+              <w:left w:val="single" w:color="C8C8D0" w:sz="4"/>
+              <w:bottom w:val="single" w:color="C8C8D0" w:sz="4"/>
+              <w:right w:val="single" w:color="C8C8D0" w:sz="4"/>
+            </w:tcBorders>
+            <w:shd w:fill="EEE3FB" w:color="auto" w:val="clear"/>
+            <w:tcMar>
+              <w:top w:type="dxa" w:w="40"/>
+              <w:left w:type="dxa" w:w="80"/>
+              <w:bottom w:type="dxa" w:w="40"/>
+              <w:right w:type="dxa" w:w="80"/>
+            </w:tcMar>
+            <w:vAlign w:val="top"/>
+          </w:tcPr>
+          <w:p>
+            <w:pPr>
+              <w:spacing w:after="0" w:line="240"/>
+            </w:pPr>
+            <w:r>
+              <w:rPr>
+                <w:rFonts w:ascii="Calibri" w:cs="Calibri" w:eastAsia="Calibri" w:hAnsi="Calibri"/>
+                <w:b/>
+                <w:bCs/>
+                <w:color w:val="5B2E99"/>
+                <w:sz w:val="16"/>
+                <w:szCs w:val="16"/>
+              </w:rPr>
+              <w:t xml:space="preserve">Onde</w:t>
+            </w:r>
+          </w:p>
+        </w:tc>
+      </w:tr>
+      <w:tr>
+        <w:trPr>
+          <w:cantSplit/>
+        </w:trPr>
+        <w:tc>
+          <w:tcPr>
+            <w:tcW w:type="dxa" w:w="2448"/>
+            <w:tcBorders>
+              <w:top w:val="single" w:color="C8C8D0" w:sz="4"/>
+              <w:left w:val="single" w:color="C8C8D0" w:sz="4"/>
+              <w:bottom w:val="single" w:color="C8C8D0" w:sz="4"/>
+              <w:right w:val="single" w:color="C8C8D0" w:sz="4"/>
+            </w:tcBorders>
+            <w:tcMar>
+              <w:top w:type="dxa" w:w="40"/>
+              <w:left w:type="dxa" w:w="80"/>
+              <w:bottom w:type="dxa" w:w="40"/>
+              <w:right w:type="dxa" w:w="80"/>
+            </w:tcMar>
+            <w:vAlign w:val="top"/>
+          </w:tcPr>
+          <w:p>
+            <w:pPr>
+              <w:spacing w:after="0" w:line="240"/>
+            </w:pPr>
+            <w:r>
+              <w:rPr>
+                <w:rFonts w:ascii="Calibri" w:cs="Calibri" w:eastAsia="Calibri" w:hAnsi="Calibri"/>
+                <w:b w:val="false"/>
+                <w:bCs w:val="false"/>
+                <w:sz w:val="16"/>
+                <w:szCs w:val="16"/>
+              </w:rPr>
+              <w:t xml:space="preserve">Margem lateral</w:t>
+            </w:r>
+          </w:p>
+        </w:tc>
+        <w:tc>
+          <w:tcPr>
+            <w:tcW w:type="dxa" w:w="4693"/>
+            <w:tcBorders>
+              <w:top w:val="single" w:color="C8C8D0" w:sz="4"/>
+              <w:left w:val="single" w:color="C8C8D0" w:sz="4"/>
+              <w:bottom w:val="single" w:color="C8C8D0" w:sz="4"/>
+              <w:right w:val="single" w:color="C8C8D0" w:sz="4"/>
+            </w:tcBorders>
+            <w:tcMar>
+              <w:top w:type="dxa" w:w="40"/>
+              <w:left w:type="dxa" w:w="80"/>
+              <w:bottom w:type="dxa" w:w="40"/>
+              <w:right w:type="dxa" w:w="80"/>
+            </w:tcMar>
+            <w:vAlign w:val="top"/>
+          </w:tcPr>
+          <w:p>
+            <w:pPr>
+              <w:spacing w:after="0" w:line="240"/>
+            </w:pPr>
+            <w:r>
+              <w:rPr>
+                <w:rFonts w:ascii="Calibri" w:cs="Calibri" w:eastAsia="Calibri" w:hAnsi="Calibri"/>
+                <w:b w:val="false"/>
+                <w:bCs w:val="false"/>
+                <w:sz w:val="16"/>
+                <w:szCs w:val="16"/>
+              </w:rPr>
+              <w:t xml:space="preserve">16 (space.sm) nas telas de conteúdo; as linhas de lista ocupam a largura toda entre as margens</w:t>
+            </w:r>
+          </w:p>
+        </w:tc>
+        <w:tc>
+          <w:tcPr>
+            <w:tcW w:type="dxa" w:w="3063"/>
+            <w:tcBorders>
+              <w:top w:val="single" w:color="C8C8D0" w:sz="4"/>
+              <w:left w:val="single" w:color="C8C8D0" w:sz="4"/>
+              <w:bottom w:val="single" w:color="C8C8D0" w:sz="4"/>
+              <w:right w:val="single" w:color="C8C8D0" w:sz="4"/>
+            </w:tcBorders>
+            <w:tcMar>
+              <w:top w:type="dxa" w:w="40"/>
+              <w:left w:type="dxa" w:w="80"/>
+              <w:bottom w:type="dxa" w:w="40"/>
+              <w:right w:type="dxa" w:w="80"/>
+            </w:tcMar>
+            <w:vAlign w:val="top"/>
+          </w:tcPr>
+          <w:p>
+            <w:pPr>
+              <w:spacing w:after="0" w:line="240"/>
+            </w:pPr>
+            <w:r>
+              <w:rPr>
+                <w:rFonts w:ascii="Calibri" w:cs="Calibri" w:eastAsia="Calibri" w:hAnsi="Calibri"/>
+                <w:b w:val="false"/>
+                <w:bCs w:val="false"/>
+                <w:sz w:val="16"/>
+                <w:szCs w:val="16"/>
+              </w:rPr>
+              <w:t xml:space="preserve">Oncologia, Saúde Mental, Hub e mais 10 telas</w:t>
+            </w:r>
+          </w:p>
+        </w:tc>
+      </w:tr>
+      <w:tr>
+        <w:trPr>
+          <w:cantSplit/>
+        </w:trPr>
+        <w:tc>
+          <w:tcPr>
+            <w:tcW w:type="dxa" w:w="2448"/>
+            <w:tcBorders>
+              <w:top w:val="single" w:color="C8C8D0" w:sz="4"/>
+              <w:left w:val="single" w:color="C8C8D0" w:sz="4"/>
+              <w:bottom w:val="single" w:color="C8C8D0" w:sz="4"/>
+              <w:right w:val="single" w:color="C8C8D0" w:sz="4"/>
+            </w:tcBorders>
+            <w:tcMar>
+              <w:top w:type="dxa" w:w="40"/>
+              <w:left w:type="dxa" w:w="80"/>
+              <w:bottom w:type="dxa" w:w="40"/>
+              <w:right w:type="dxa" w:w="80"/>
+            </w:tcMar>
+            <w:vAlign w:val="top"/>
+          </w:tcPr>
+          <w:p>
+            <w:pPr>
+              <w:spacing w:after="0" w:line="240"/>
+            </w:pPr>
+            <w:r>
+              <w:rPr>
+                <w:rFonts w:ascii="Calibri" w:cs="Calibri" w:eastAsia="Calibri" w:hAnsi="Calibri"/>
+                <w:b w:val="false"/>
+                <w:bCs w:val="false"/>
+                <w:sz w:val="16"/>
+                <w:szCs w:val="16"/>
+              </w:rPr>
+              <w:t xml:space="preserve">Largura máxima</w:t>
+            </w:r>
+          </w:p>
+        </w:tc>
+        <w:tc>
+          <w:tcPr>
+            <w:tcW w:type="dxa" w:w="4693"/>
+            <w:tcBorders>
+              <w:top w:val="single" w:color="C8C8D0" w:sz="4"/>
+              <w:left w:val="single" w:color="C8C8D0" w:sz="4"/>
+              <w:bottom w:val="single" w:color="C8C8D0" w:sz="4"/>
+              <w:right w:val="single" w:color="C8C8D0" w:sz="4"/>
+            </w:tcBorders>
+            <w:tcMar>
+              <w:top w:type="dxa" w:w="40"/>
+              <w:left w:type="dxa" w:w="80"/>
+              <w:bottom w:type="dxa" w:w="40"/>
+              <w:right w:type="dxa" w:w="80"/>
+            </w:tcMar>
+            <w:vAlign w:val="top"/>
+          </w:tcPr>
+          <w:p>
+            <w:pPr>
+              <w:spacing w:after="0" w:line="240"/>
+            </w:pPr>
+            <w:r>
+              <w:rPr>
+                <w:rFonts w:ascii="Calibri" w:cs="Calibri" w:eastAsia="Calibri" w:hAnsi="Calibri"/>
+                <w:b w:val="false"/>
+                <w:bCs w:val="false"/>
+                <w:sz w:val="16"/>
+                <w:szCs w:val="16"/>
+              </w:rPr>
+              <w:t xml:space="preserve">560 (layout.maxContentWidth), centralizado. Em tablet e web o conteúdo não se estica</w:t>
+            </w:r>
+          </w:p>
+        </w:tc>
+        <w:tc>
+          <w:tcPr>
+            <w:tcW w:type="dxa" w:w="3063"/>
+            <w:tcBorders>
+              <w:top w:val="single" w:color="C8C8D0" w:sz="4"/>
+              <w:left w:val="single" w:color="C8C8D0" w:sz="4"/>
+              <w:bottom w:val="single" w:color="C8C8D0" w:sz="4"/>
+              <w:right w:val="single" w:color="C8C8D0" w:sz="4"/>
+            </w:tcBorders>
+            <w:tcMar>
+              <w:top w:type="dxa" w:w="40"/>
+              <w:left w:type="dxa" w:w="80"/>
+              <w:bottom w:type="dxa" w:w="40"/>
+              <w:right w:type="dxa" w:w="80"/>
+            </w:tcMar>
+            <w:vAlign w:val="top"/>
+          </w:tcPr>
+          <w:p>
+            <w:pPr>
+              <w:spacing w:after="0" w:line="240"/>
+            </w:pPr>
+            <w:r>
+              <w:rPr>
+                <w:rFonts w:ascii="Calibri" w:cs="Calibri" w:eastAsia="Calibri" w:hAnsi="Calibri"/>
+                <w:b w:val="false"/>
+                <w:bCs w:val="false"/>
+                <w:sz w:val="16"/>
+                <w:szCs w:val="16"/>
+              </w:rPr>
+              <w:t xml:space="preserve">Gate de login, modal de login, diálogos, toast</w:t>
+            </w:r>
+          </w:p>
+        </w:tc>
+      </w:tr>
+      <w:tr>
+        <w:trPr>
+          <w:cantSplit/>
+        </w:trPr>
+        <w:tc>
+          <w:tcPr>
+            <w:tcW w:type="dxa" w:w="2448"/>
+            <w:tcBorders>
+              <w:top w:val="single" w:color="C8C8D0" w:sz="4"/>
+              <w:left w:val="single" w:color="C8C8D0" w:sz="4"/>
+              <w:bottom w:val="single" w:color="C8C8D0" w:sz="4"/>
+              <w:right w:val="single" w:color="C8C8D0" w:sz="4"/>
+            </w:tcBorders>
+            <w:tcMar>
+              <w:top w:type="dxa" w:w="40"/>
+              <w:left w:type="dxa" w:w="80"/>
+              <w:bottom w:type="dxa" w:w="40"/>
+              <w:right w:type="dxa" w:w="80"/>
+            </w:tcMar>
+            <w:vAlign w:val="top"/>
+          </w:tcPr>
+          <w:p>
+            <w:pPr>
+              <w:spacing w:after="0" w:line="240"/>
+            </w:pPr>
+            <w:r>
+              <w:rPr>
+                <w:rFonts w:ascii="Calibri" w:cs="Calibri" w:eastAsia="Calibri" w:hAnsi="Calibri"/>
+                <w:b w:val="false"/>
+                <w:bCs w:val="false"/>
+                <w:sz w:val="16"/>
+                <w:szCs w:val="16"/>
+              </w:rPr>
+              <w:t xml:space="preserve">Colunas</w:t>
+            </w:r>
+          </w:p>
+        </w:tc>
+        <w:tc>
+          <w:tcPr>
+            <w:tcW w:type="dxa" w:w="4693"/>
+            <w:tcBorders>
+              <w:top w:val="single" w:color="C8C8D0" w:sz="4"/>
+              <w:left w:val="single" w:color="C8C8D0" w:sz="4"/>
+              <w:bottom w:val="single" w:color="C8C8D0" w:sz="4"/>
+              <w:right w:val="single" w:color="C8C8D0" w:sz="4"/>
+            </w:tcBorders>
+            <w:tcMar>
+              <w:top w:type="dxa" w:w="40"/>
+              <w:left w:type="dxa" w:w="80"/>
+              <w:bottom w:type="dxa" w:w="40"/>
+              <w:right w:type="dxa" w:w="80"/>
+            </w:tcMar>
+            <w:vAlign w:val="top"/>
+          </w:tcPr>
+          <w:p>
+            <w:pPr>
+              <w:spacing w:after="0" w:line="240"/>
+            </w:pPr>
+            <w:r>
+              <w:rPr>
+                <w:rFonts w:ascii="Calibri" w:cs="Calibri" w:eastAsia="Calibri" w:hAnsi="Calibri"/>
+                <w:b w:val="false"/>
+                <w:bCs w:val="false"/>
+                <w:sz w:val="16"/>
+                <w:szCs w:val="16"/>
+              </w:rPr>
+              <w:t xml:space="preserve">1 coluna para listas e formulários; 2 colunas (48% + espaço entre elas) na grade do Início</w:t>
+            </w:r>
+          </w:p>
+        </w:tc>
+        <w:tc>
+          <w:tcPr>
+            <w:tcW w:type="dxa" w:w="3063"/>
+            <w:tcBorders>
+              <w:top w:val="single" w:color="C8C8D0" w:sz="4"/>
+              <w:left w:val="single" w:color="C8C8D0" w:sz="4"/>
+              <w:bottom w:val="single" w:color="C8C8D0" w:sz="4"/>
+              <w:right w:val="single" w:color="C8C8D0" w:sz="4"/>
+            </w:tcBorders>
+            <w:tcMar>
+              <w:top w:type="dxa" w:w="40"/>
+              <w:left w:type="dxa" w:w="80"/>
+              <w:bottom w:type="dxa" w:w="40"/>
+              <w:right w:type="dxa" w:w="80"/>
+            </w:tcMar>
+            <w:vAlign w:val="top"/>
+          </w:tcPr>
+          <w:p>
+            <w:pPr>
+              <w:spacing w:after="0" w:line="240"/>
+            </w:pPr>
+            <w:r>
+              <w:rPr>
+                <w:rFonts w:ascii="Calibri" w:cs="Calibri" w:eastAsia="Calibri" w:hAnsi="Calibri"/>
+                <w:b w:val="false"/>
+                <w:bCs w:val="false"/>
+                <w:sz w:val="16"/>
+                <w:szCs w:val="16"/>
+              </w:rPr>
+              <w:t xml:space="preserve">NavigationGrid · HomeNavigationGrid</w:t>
+            </w:r>
+          </w:p>
+        </w:tc>
+      </w:tr>
+      <w:tr>
+        <w:trPr>
+          <w:cantSplit/>
+        </w:trPr>
+        <w:tc>
+          <w:tcPr>
+            <w:tcW w:type="dxa" w:w="2448"/>
+            <w:tcBorders>
+              <w:top w:val="single" w:color="C8C8D0" w:sz="4"/>
+              <w:left w:val="single" w:color="C8C8D0" w:sz="4"/>
+              <w:bottom w:val="single" w:color="C8C8D0" w:sz="4"/>
+              <w:right w:val="single" w:color="C8C8D0" w:sz="4"/>
+            </w:tcBorders>
+            <w:tcMar>
+              <w:top w:type="dxa" w:w="40"/>
+              <w:left w:type="dxa" w:w="80"/>
+              <w:bottom w:type="dxa" w:w="40"/>
+              <w:right w:type="dxa" w:w="80"/>
+            </w:tcMar>
+            <w:vAlign w:val="top"/>
+          </w:tcPr>
+          <w:p>
+            <w:pPr>
+              <w:spacing w:after="0" w:line="240"/>
+            </w:pPr>
+            <w:r>
+              <w:rPr>
+                <w:rFonts w:ascii="Calibri" w:cs="Calibri" w:eastAsia="Calibri" w:hAnsi="Calibri"/>
+                <w:b w:val="false"/>
+                <w:bCs w:val="false"/>
+                <w:sz w:val="16"/>
+                <w:szCs w:val="16"/>
+              </w:rPr>
+              <w:t xml:space="preserve">Carrossel</w:t>
+            </w:r>
+          </w:p>
+        </w:tc>
+        <w:tc>
+          <w:tcPr>
+            <w:tcW w:type="dxa" w:w="4693"/>
+            <w:tcBorders>
+              <w:top w:val="single" w:color="C8C8D0" w:sz="4"/>
+              <w:left w:val="single" w:color="C8C8D0" w:sz="4"/>
+              <w:bottom w:val="single" w:color="C8C8D0" w:sz="4"/>
+              <w:right w:val="single" w:color="C8C8D0" w:sz="4"/>
+            </w:tcBorders>
+            <w:tcMar>
+              <w:top w:type="dxa" w:w="40"/>
+              <w:left w:type="dxa" w:w="80"/>
+              <w:bottom w:type="dxa" w:w="40"/>
+              <w:right w:type="dxa" w:w="80"/>
+            </w:tcMar>
+            <w:vAlign w:val="top"/>
+          </w:tcPr>
+          <w:p>
+            <w:pPr>
+              <w:spacing w:after="0" w:line="240"/>
+            </w:pPr>
+            <w:r>
+              <w:rPr>
+                <w:rFonts w:ascii="Calibri" w:cs="Calibri" w:eastAsia="Calibri" w:hAnsi="Calibri"/>
+                <w:b w:val="false"/>
+                <w:bCs w:val="false"/>
+                <w:sz w:val="16"/>
+                <w:szCs w:val="16"/>
+              </w:rPr>
+              <w:t xml:space="preserve">Cards de 110×160 com 10 de espaço entre eles e encaixe por card (snap)</w:t>
+            </w:r>
+          </w:p>
+        </w:tc>
+        <w:tc>
+          <w:tcPr>
+            <w:tcW w:type="dxa" w:w="3063"/>
+            <w:tcBorders>
+              <w:top w:val="single" w:color="C8C8D0" w:sz="4"/>
+              <w:left w:val="single" w:color="C8C8D0" w:sz="4"/>
+              <w:bottom w:val="single" w:color="C8C8D0" w:sz="4"/>
+              <w:right w:val="single" w:color="C8C8D0" w:sz="4"/>
+            </w:tcBorders>
+            <w:tcMar>
+              <w:top w:type="dxa" w:w="40"/>
+              <w:left w:type="dxa" w:w="80"/>
+              <w:bottom w:type="dxa" w:w="40"/>
+              <w:right w:type="dxa" w:w="80"/>
+            </w:tcMar>
+            <w:vAlign w:val="top"/>
+          </w:tcPr>
+          <w:p>
+            <w:pPr>
+              <w:spacing w:after="0" w:line="240"/>
+            </w:pPr>
+            <w:r>
+              <w:rPr>
+                <w:rFonts w:ascii="Calibri" w:cs="Calibri" w:eastAsia="Calibri" w:hAnsi="Calibri"/>
+                <w:b w:val="false"/>
+                <w:bCs w:val="false"/>
+                <w:sz w:val="16"/>
+                <w:szCs w:val="16"/>
+              </w:rPr>
+              <w:t xml:space="preserve">Lazer (RecomendationPager)</w:t>
+            </w:r>
+          </w:p>
+        </w:tc>
+      </w:tr>
+      <w:tr>
+        <w:trPr>
+          <w:cantSplit/>
+        </w:trPr>
+        <w:tc>
+          <w:tcPr>
+            <w:tcW w:type="dxa" w:w="2448"/>
+            <w:tcBorders>
+              <w:top w:val="single" w:color="C8C8D0" w:sz="4"/>
+              <w:left w:val="single" w:color="C8C8D0" w:sz="4"/>
+              <w:bottom w:val="single" w:color="C8C8D0" w:sz="4"/>
+              <w:right w:val="single" w:color="C8C8D0" w:sz="4"/>
+            </w:tcBorders>
+            <w:tcMar>
+              <w:top w:type="dxa" w:w="40"/>
+              <w:left w:type="dxa" w:w="80"/>
+              <w:bottom w:type="dxa" w:w="40"/>
+              <w:right w:type="dxa" w:w="80"/>
+            </w:tcMar>
+            <w:vAlign w:val="top"/>
+          </w:tcPr>
+          <w:p>
+            <w:pPr>
+              <w:spacing w:after="0" w:line="240"/>
+            </w:pPr>
+            <w:r>
+              <w:rPr>
+                <w:rFonts w:ascii="Calibri" w:cs="Calibri" w:eastAsia="Calibri" w:hAnsi="Calibri"/>
+                <w:b w:val="false"/>
+                <w:bCs w:val="false"/>
+                <w:sz w:val="16"/>
+                <w:szCs w:val="16"/>
+              </w:rPr>
+              <w:t xml:space="preserve">Container das áreas</w:t>
+            </w:r>
+          </w:p>
+        </w:tc>
+        <w:tc>
+          <w:tcPr>
+            <w:tcW w:type="dxa" w:w="4693"/>
+            <w:tcBorders>
+              <w:top w:val="single" w:color="C8C8D0" w:sz="4"/>
+              <w:left w:val="single" w:color="C8C8D0" w:sz="4"/>
+              <w:bottom w:val="single" w:color="C8C8D0" w:sz="4"/>
+              <w:right w:val="single" w:color="C8C8D0" w:sz="4"/>
+            </w:tcBorders>
+            <w:tcMar>
+              <w:top w:type="dxa" w:w="40"/>
+              <w:left w:type="dxa" w:w="80"/>
+              <w:bottom w:type="dxa" w:w="40"/>
+              <w:right w:type="dxa" w:w="80"/>
+            </w:tcMar>
+            <w:vAlign w:val="top"/>
+          </w:tcPr>
+          <w:p>
+            <w:pPr>
+              <w:spacing w:after="0" w:line="240"/>
+            </w:pPr>
+            <w:r>
+              <w:rPr>
+                <w:rFonts w:ascii="Calibri" w:cs="Calibri" w:eastAsia="Calibri" w:hAnsi="Calibri"/>
+                <w:b w:val="false"/>
+                <w:bCs w:val="false"/>
+                <w:sz w:val="16"/>
+                <w:szCs w:val="16"/>
+              </w:rPr>
+              <w:t xml:space="preserve">Card branco com 93% da altura, cantos superiores de raio 50 e conteúdo recortado nas bordas</w:t>
+            </w:r>
+          </w:p>
+        </w:tc>
+        <w:tc>
+          <w:tcPr>
+            <w:tcW w:type="dxa" w:w="3063"/>
+            <w:tcBorders>
+              <w:top w:val="single" w:color="C8C8D0" w:sz="4"/>
+              <w:left w:val="single" w:color="C8C8D0" w:sz="4"/>
+              <w:bottom w:val="single" w:color="C8C8D0" w:sz="4"/>
+              <w:right w:val="single" w:color="C8C8D0" w:sz="4"/>
+            </w:tcBorders>
+            <w:tcMar>
+              <w:top w:type="dxa" w:w="40"/>
+              <w:left w:type="dxa" w:w="80"/>
+              <w:bottom w:type="dxa" w:w="40"/>
+              <w:right w:type="dxa" w:w="80"/>
+            </w:tcMar>
+            <w:vAlign w:val="top"/>
+          </w:tcPr>
+          <w:p>
+            <w:pPr>
+              <w:spacing w:after="0" w:line="240"/>
+            </w:pPr>
+            <w:r>
+              <w:rPr>
+                <w:rFonts w:ascii="Calibri" w:cs="Calibri" w:eastAsia="Calibri" w:hAnsi="Calibri"/>
+                <w:b w:val="false"/>
+                <w:bCs w:val="false"/>
+                <w:sz w:val="16"/>
+                <w:szCs w:val="16"/>
+              </w:rPr>
+              <w:t xml:space="preserve">CommonAreasLayout</w:t>
+            </w:r>
+          </w:p>
+        </w:tc>
+      </w:tr>
+      <w:tr>
+        <w:trPr>
+          <w:cantSplit/>
+        </w:trPr>
+        <w:tc>
+          <w:tcPr>
+            <w:tcW w:type="dxa" w:w="2448"/>
+            <w:tcBorders>
+              <w:top w:val="single" w:color="C8C8D0" w:sz="4"/>
+              <w:left w:val="single" w:color="C8C8D0" w:sz="4"/>
+              <w:bottom w:val="single" w:color="C8C8D0" w:sz="4"/>
+              <w:right w:val="single" w:color="C8C8D0" w:sz="4"/>
+            </w:tcBorders>
+            <w:tcMar>
+              <w:top w:type="dxa" w:w="40"/>
+              <w:left w:type="dxa" w:w="80"/>
+              <w:bottom w:type="dxa" w:w="40"/>
+              <w:right w:type="dxa" w:w="80"/>
+            </w:tcMar>
+            <w:vAlign w:val="top"/>
+          </w:tcPr>
+          <w:p>
+            <w:pPr>
+              <w:spacing w:after="0" w:line="240"/>
+            </w:pPr>
+            <w:r>
+              <w:rPr>
+                <w:rFonts w:ascii="Calibri" w:cs="Calibri" w:eastAsia="Calibri" w:hAnsi="Calibri"/>
+                <w:b w:val="false"/>
+                <w:bCs w:val="false"/>
+                <w:sz w:val="16"/>
+                <w:szCs w:val="16"/>
+              </w:rPr>
+              <w:t xml:space="preserve">Faixas fixas</w:t>
+            </w:r>
+          </w:p>
+        </w:tc>
+        <w:tc>
+          <w:tcPr>
+            <w:tcW w:type="dxa" w:w="4693"/>
+            <w:tcBorders>
+              <w:top w:val="single" w:color="C8C8D0" w:sz="4"/>
+              <w:left w:val="single" w:color="C8C8D0" w:sz="4"/>
+              <w:bottom w:val="single" w:color="C8C8D0" w:sz="4"/>
+              <w:right w:val="single" w:color="C8C8D0" w:sz="4"/>
+            </w:tcBorders>
+            <w:tcMar>
+              <w:top w:type="dxa" w:w="40"/>
+              <w:left w:type="dxa" w:w="80"/>
+              <w:bottom w:type="dxa" w:w="40"/>
+              <w:right w:type="dxa" w:w="80"/>
+            </w:tcMar>
+            <w:vAlign w:val="top"/>
+          </w:tcPr>
+          <w:p>
+            <w:pPr>
+              <w:spacing w:after="0" w:line="240"/>
+            </w:pPr>
+            <w:r>
+              <w:rPr>
+                <w:rFonts w:ascii="Calibri" w:cs="Calibri" w:eastAsia="Calibri" w:hAnsi="Calibri"/>
+                <w:b w:val="false"/>
+                <w:bCs w:val="false"/>
+                <w:sz w:val="16"/>
+                <w:szCs w:val="16"/>
+              </w:rPr>
+              <w:t xml:space="preserve">Header opaco no topo e barra de abas de 72 na base; o conteúdo rola entre as duas</w:t>
+            </w:r>
+          </w:p>
+        </w:tc>
+        <w:tc>
+          <w:tcPr>
+            <w:tcW w:type="dxa" w:w="3063"/>
+            <w:tcBorders>
+              <w:top w:val="single" w:color="C8C8D0" w:sz="4"/>
+              <w:left w:val="single" w:color="C8C8D0" w:sz="4"/>
+              <w:bottom w:val="single" w:color="C8C8D0" w:sz="4"/>
+              <w:right w:val="single" w:color="C8C8D0" w:sz="4"/>
+            </w:tcBorders>
+            <w:tcMar>
+              <w:top w:type="dxa" w:w="40"/>
+              <w:left w:type="dxa" w:w="80"/>
+              <w:bottom w:type="dxa" w:w="40"/>
+              <w:right w:type="dxa" w:w="80"/>
+            </w:tcMar>
+            <w:vAlign w:val="top"/>
+          </w:tcPr>
+          <w:p>
+            <w:pPr>
+              <w:spacing w:after="0" w:line="240"/>
+            </w:pPr>
+            <w:r>
+              <w:rPr>
+                <w:rFonts w:ascii="Calibri" w:cs="Calibri" w:eastAsia="Calibri" w:hAnsi="Calibri"/>
+                <w:b w:val="false"/>
+                <w:bCs w:val="false"/>
+                <w:sz w:val="16"/>
+                <w:szCs w:val="16"/>
+              </w:rPr>
+              <w:t xml:space="preserve">(Home)/_layout.tsx · CommonScreenOptions</w:t>
+            </w:r>
+          </w:p>
+        </w:tc>
+      </w:tr>
+    </w:tbl>
+    <w:p>
+      <w:pPr>
+        <w:spacing w:after="80"/>
+      </w:pPr>
+    </w:p>
+    <w:p>
+      <w:pPr>
+        <w:pStyle w:val="Heading2"/>
+        <w:keepNext/>
+      </w:pPr>
+      <w:r>
+        <w:rPr>
+          <w:rFonts w:ascii="Calibri" w:cs="Calibri" w:eastAsia="Calibri" w:hAnsi="Calibri"/>
+        </w:rPr>
         <w:t xml:space="preserve">Componentes e estados</w:t>
       </w:r>
     </w:p>
@@ -2900,7 +3683,7 @@
                 <w:sz w:val="16"/>
                 <w:szCs w:val="16"/>
               </w:rPr>
-              <w:t xml:space="preserve">primary, secondary, ghost, danger × default, pressed, focus, disabled, loading</w:t>
+              <w:t xml:space="preserve">primary, secondary, ghost, danger × default, hover (web), pressed, focus, disabled, loading</w:t>
             </w:r>
           </w:p>
         </w:tc>
@@ -2933,7 +3716,7 @@
                 <w:sz w:val="16"/>
                 <w:szCs w:val="16"/>
               </w:rPr>
-              <w:t xml:space="preserve">role button, accessibilityState (disabled/busy), altura 48, spinner na cor do texto</w:t>
+              <w:t xml:space="preserve">role button, accessibilityState (disabled/busy), altura 48, spinner na cor do texto; hover só com ponteiro</w:t>
             </w:r>
           </w:p>
         </w:tc>
@@ -3707,7 +4490,7 @@
           <w:sz w:val="19"/>
           <w:szCs w:val="19"/>
         </w:rPr>
-        <w:t xml:space="preserve">Script: npx tsx apps/mobile/scripts/check-contrast.ts. Ele calcula (L1 + 0.05) / (L2 + 0.05) para todos os pares registrados em tokens.ts e falha se algum ficar abaixo de 4.5:1. Resultado na v1: 13 de 15 pares reprovados. Na v2: 25 de 25 aprovados. A v3 não alterou tokens e repete o resultado (25/25, verificado no commit 6cf7d36).</w:t>
+        <w:t xml:space="preserve">Script: npx tsx apps/mobile/scripts/check-contrast.ts. Ele calcula (L1 + 0.05) / (L2 + 0.05) para todos os pares registrados em tokens.ts e falha se algum ficar abaixo de 4.5:1. Resultado na v1: 13 de 15 pares reprovados. Na v2: 25 de 25 aprovados. Na v3, com os 3 pares de hover: 28 de 28 aprovados.</w:t>
       </w:r>
     </w:p>
     <w:p>
@@ -6487,7 +7270,7 @@
         <w:rPr>
           <w:rFonts w:ascii="Calibri" w:cs="Calibri" w:eastAsia="Calibri" w:hAnsi="Calibri"/>
         </w:rPr>
-        <w:t xml:space="preserve">v2 e v3 (depois)</w:t>
+        <w:t xml:space="preserve">v3 (atual)</w:t>
       </w:r>
     </w:p>
     <w:tbl>
@@ -8423,7 +9206,7 @@
                 <w:sz w:val="15"/>
                 <w:szCs w:val="15"/>
               </w:rPr>
-              <w:t xml:space="preserve">Botão primário (pressed)</w:t>
+              <w:t xml:space="preserve">Botão primário (hover, web)</w:t>
             </w:r>
           </w:p>
         </w:tc>
@@ -8489,7 +9272,7 @@
                 <w:sz w:val="15"/>
                 <w:szCs w:val="15"/>
               </w:rPr>
-              <w:t xml:space="preserve">#5B2E99</w:t>
+              <w:t xml:space="preserve">#6A35AF</w:t>
             </w:r>
           </w:p>
         </w:tc>
@@ -8522,7 +9305,7 @@
                 <w:sz w:val="15"/>
                 <w:szCs w:val="15"/>
               </w:rPr>
-              <w:t xml:space="preserve">9.15:1</w:t>
+              <w:t xml:space="preserve">7.66:1</w:t>
             </w:r>
           </w:p>
         </w:tc>
@@ -8593,7 +9376,7 @@
                 <w:sz w:val="15"/>
                 <w:szCs w:val="15"/>
               </w:rPr>
-              <w:t xml:space="preserve">Botão SOS / perigo</w:t>
+              <w:t xml:space="preserve">Botão primário (pressed)</w:t>
             </w:r>
           </w:p>
         </w:tc>
@@ -8659,7 +9442,7 @@
                 <w:sz w:val="15"/>
                 <w:szCs w:val="15"/>
               </w:rPr>
-              <w:t xml:space="preserve">#B3261E</w:t>
+              <w:t xml:space="preserve">#5B2E99</w:t>
             </w:r>
           </w:p>
         </w:tc>
@@ -8692,7 +9475,7 @@
                 <w:sz w:val="15"/>
                 <w:szCs w:val="15"/>
               </w:rPr>
-              <w:t xml:space="preserve">6.54:1</w:t>
+              <w:t xml:space="preserve">9.15:1</w:t>
             </w:r>
           </w:p>
         </w:tc>
@@ -8763,6 +9546,346 @@
                 <w:sz w:val="15"/>
                 <w:szCs w:val="15"/>
               </w:rPr>
+              <w:t xml:space="preserve">Botão SOS / perigo</w:t>
+            </w:r>
+          </w:p>
+        </w:tc>
+        <w:tc>
+          <w:tcPr>
+            <w:tcW w:type="dxa" w:w="1224"/>
+            <w:tcBorders>
+              <w:top w:val="single" w:color="C8C8D0" w:sz="4"/>
+              <w:left w:val="single" w:color="C8C8D0" w:sz="4"/>
+              <w:bottom w:val="single" w:color="C8C8D0" w:sz="4"/>
+              <w:right w:val="single" w:color="C8C8D0" w:sz="4"/>
+            </w:tcBorders>
+            <w:tcMar>
+              <w:top w:type="dxa" w:w="40"/>
+              <w:left w:type="dxa" w:w="80"/>
+              <w:bottom w:type="dxa" w:w="40"/>
+              <w:right w:type="dxa" w:w="80"/>
+            </w:tcMar>
+            <w:vAlign w:val="top"/>
+          </w:tcPr>
+          <w:p>
+            <w:pPr>
+              <w:spacing w:after="0" w:line="240"/>
+            </w:pPr>
+            <w:r>
+              <w:rPr>
+                <w:rFonts w:ascii="Calibri" w:cs="Calibri" w:eastAsia="Calibri" w:hAnsi="Calibri"/>
+                <w:b w:val="false"/>
+                <w:bCs w:val="false"/>
+                <w:sz w:val="15"/>
+                <w:szCs w:val="15"/>
+              </w:rPr>
+              <w:t xml:space="preserve">#FFFFFF</w:t>
+            </w:r>
+          </w:p>
+        </w:tc>
+        <w:tc>
+          <w:tcPr>
+            <w:tcW w:type="dxa" w:w="1224"/>
+            <w:tcBorders>
+              <w:top w:val="single" w:color="C8C8D0" w:sz="4"/>
+              <w:left w:val="single" w:color="C8C8D0" w:sz="4"/>
+              <w:bottom w:val="single" w:color="C8C8D0" w:sz="4"/>
+              <w:right w:val="single" w:color="C8C8D0" w:sz="4"/>
+            </w:tcBorders>
+            <w:tcMar>
+              <w:top w:type="dxa" w:w="40"/>
+              <w:left w:type="dxa" w:w="80"/>
+              <w:bottom w:type="dxa" w:w="40"/>
+              <w:right w:type="dxa" w:w="80"/>
+            </w:tcMar>
+            <w:vAlign w:val="top"/>
+          </w:tcPr>
+          <w:p>
+            <w:pPr>
+              <w:spacing w:after="0" w:line="240"/>
+            </w:pPr>
+            <w:r>
+              <w:rPr>
+                <w:rFonts w:ascii="Calibri" w:cs="Calibri" w:eastAsia="Calibri" w:hAnsi="Calibri"/>
+                <w:b w:val="false"/>
+                <w:bCs w:val="false"/>
+                <w:sz w:val="15"/>
+                <w:szCs w:val="15"/>
+              </w:rPr>
+              <w:t xml:space="preserve">#B3261E</w:t>
+            </w:r>
+          </w:p>
+        </w:tc>
+        <w:tc>
+          <w:tcPr>
+            <w:tcW w:type="dxa" w:w="1224"/>
+            <w:tcBorders>
+              <w:top w:val="single" w:color="C8C8D0" w:sz="4"/>
+              <w:left w:val="single" w:color="C8C8D0" w:sz="4"/>
+              <w:bottom w:val="single" w:color="C8C8D0" w:sz="4"/>
+              <w:right w:val="single" w:color="C8C8D0" w:sz="4"/>
+            </w:tcBorders>
+            <w:tcMar>
+              <w:top w:type="dxa" w:w="40"/>
+              <w:left w:type="dxa" w:w="80"/>
+              <w:bottom w:type="dxa" w:w="40"/>
+              <w:right w:type="dxa" w:w="80"/>
+            </w:tcMar>
+            <w:vAlign w:val="top"/>
+          </w:tcPr>
+          <w:p>
+            <w:pPr>
+              <w:spacing w:after="0" w:line="240"/>
+            </w:pPr>
+            <w:r>
+              <w:rPr>
+                <w:rFonts w:ascii="Calibri" w:cs="Calibri" w:eastAsia="Calibri" w:hAnsi="Calibri"/>
+                <w:b w:val="false"/>
+                <w:bCs w:val="false"/>
+                <w:sz w:val="15"/>
+                <w:szCs w:val="15"/>
+              </w:rPr>
+              <w:t xml:space="preserve">6.54:1</w:t>
+            </w:r>
+          </w:p>
+        </w:tc>
+        <w:tc>
+          <w:tcPr>
+            <w:tcW w:type="dxa" w:w="1635"/>
+            <w:tcBorders>
+              <w:top w:val="single" w:color="C8C8D0" w:sz="4"/>
+              <w:left w:val="single" w:color="C8C8D0" w:sz="4"/>
+              <w:bottom w:val="single" w:color="C8C8D0" w:sz="4"/>
+              <w:right w:val="single" w:color="C8C8D0" w:sz="4"/>
+            </w:tcBorders>
+            <w:tcMar>
+              <w:top w:type="dxa" w:w="40"/>
+              <w:left w:type="dxa" w:w="80"/>
+              <w:bottom w:type="dxa" w:w="40"/>
+              <w:right w:type="dxa" w:w="80"/>
+            </w:tcMar>
+            <w:vAlign w:val="top"/>
+          </w:tcPr>
+          <w:p>
+            <w:pPr>
+              <w:spacing w:after="0" w:line="240"/>
+            </w:pPr>
+            <w:r>
+              <w:rPr>
+                <w:rFonts w:ascii="Calibri" w:cs="Calibri" w:eastAsia="Calibri" w:hAnsi="Calibri"/>
+                <w:b w:val="false"/>
+                <w:bCs w:val="false"/>
+                <w:sz w:val="15"/>
+                <w:szCs w:val="15"/>
+              </w:rPr>
+              <w:t xml:space="preserve">Aprovado</w:t>
+            </w:r>
+          </w:p>
+        </w:tc>
+      </w:tr>
+      <w:tr>
+        <w:trPr>
+          <w:cantSplit/>
+        </w:trPr>
+        <w:tc>
+          <w:tcPr>
+            <w:tcW w:type="dxa" w:w="4897"/>
+            <w:tcBorders>
+              <w:top w:val="single" w:color="C8C8D0" w:sz="4"/>
+              <w:left w:val="single" w:color="C8C8D0" w:sz="4"/>
+              <w:bottom w:val="single" w:color="C8C8D0" w:sz="4"/>
+              <w:right w:val="single" w:color="C8C8D0" w:sz="4"/>
+            </w:tcBorders>
+            <w:tcMar>
+              <w:top w:type="dxa" w:w="40"/>
+              <w:left w:type="dxa" w:w="80"/>
+              <w:bottom w:type="dxa" w:w="40"/>
+              <w:right w:type="dxa" w:w="80"/>
+            </w:tcMar>
+            <w:vAlign w:val="top"/>
+          </w:tcPr>
+          <w:p>
+            <w:pPr>
+              <w:spacing w:after="0" w:line="240"/>
+            </w:pPr>
+            <w:r>
+              <w:rPr>
+                <w:rFonts w:ascii="Calibri" w:cs="Calibri" w:eastAsia="Calibri" w:hAnsi="Calibri"/>
+                <w:b w:val="false"/>
+                <w:bCs w:val="false"/>
+                <w:sz w:val="15"/>
+                <w:szCs w:val="15"/>
+              </w:rPr>
+              <w:t xml:space="preserve">Botão perigo (hover, web)</w:t>
+            </w:r>
+          </w:p>
+        </w:tc>
+        <w:tc>
+          <w:tcPr>
+            <w:tcW w:type="dxa" w:w="1224"/>
+            <w:tcBorders>
+              <w:top w:val="single" w:color="C8C8D0" w:sz="4"/>
+              <w:left w:val="single" w:color="C8C8D0" w:sz="4"/>
+              <w:bottom w:val="single" w:color="C8C8D0" w:sz="4"/>
+              <w:right w:val="single" w:color="C8C8D0" w:sz="4"/>
+            </w:tcBorders>
+            <w:tcMar>
+              <w:top w:type="dxa" w:w="40"/>
+              <w:left w:type="dxa" w:w="80"/>
+              <w:bottom w:type="dxa" w:w="40"/>
+              <w:right w:type="dxa" w:w="80"/>
+            </w:tcMar>
+            <w:vAlign w:val="top"/>
+          </w:tcPr>
+          <w:p>
+            <w:pPr>
+              <w:spacing w:after="0" w:line="240"/>
+            </w:pPr>
+            <w:r>
+              <w:rPr>
+                <w:rFonts w:ascii="Calibri" w:cs="Calibri" w:eastAsia="Calibri" w:hAnsi="Calibri"/>
+                <w:b w:val="false"/>
+                <w:bCs w:val="false"/>
+                <w:sz w:val="15"/>
+                <w:szCs w:val="15"/>
+              </w:rPr>
+              <w:t xml:space="preserve">#FFFFFF</w:t>
+            </w:r>
+          </w:p>
+        </w:tc>
+        <w:tc>
+          <w:tcPr>
+            <w:tcW w:type="dxa" w:w="1224"/>
+            <w:tcBorders>
+              <w:top w:val="single" w:color="C8C8D0" w:sz="4"/>
+              <w:left w:val="single" w:color="C8C8D0" w:sz="4"/>
+              <w:bottom w:val="single" w:color="C8C8D0" w:sz="4"/>
+              <w:right w:val="single" w:color="C8C8D0" w:sz="4"/>
+            </w:tcBorders>
+            <w:tcMar>
+              <w:top w:type="dxa" w:w="40"/>
+              <w:left w:type="dxa" w:w="80"/>
+              <w:bottom w:type="dxa" w:w="40"/>
+              <w:right w:type="dxa" w:w="80"/>
+            </w:tcMar>
+            <w:vAlign w:val="top"/>
+          </w:tcPr>
+          <w:p>
+            <w:pPr>
+              <w:spacing w:after="0" w:line="240"/>
+            </w:pPr>
+            <w:r>
+              <w:rPr>
+                <w:rFonts w:ascii="Calibri" w:cs="Calibri" w:eastAsia="Calibri" w:hAnsi="Calibri"/>
+                <w:b w:val="false"/>
+                <w:bCs w:val="false"/>
+                <w:sz w:val="15"/>
+                <w:szCs w:val="15"/>
+              </w:rPr>
+              <w:t xml:space="preserve">#A0221B</w:t>
+            </w:r>
+          </w:p>
+        </w:tc>
+        <w:tc>
+          <w:tcPr>
+            <w:tcW w:type="dxa" w:w="1224"/>
+            <w:tcBorders>
+              <w:top w:val="single" w:color="C8C8D0" w:sz="4"/>
+              <w:left w:val="single" w:color="C8C8D0" w:sz="4"/>
+              <w:bottom w:val="single" w:color="C8C8D0" w:sz="4"/>
+              <w:right w:val="single" w:color="C8C8D0" w:sz="4"/>
+            </w:tcBorders>
+            <w:tcMar>
+              <w:top w:type="dxa" w:w="40"/>
+              <w:left w:type="dxa" w:w="80"/>
+              <w:bottom w:type="dxa" w:w="40"/>
+              <w:right w:type="dxa" w:w="80"/>
+            </w:tcMar>
+            <w:vAlign w:val="top"/>
+          </w:tcPr>
+          <w:p>
+            <w:pPr>
+              <w:spacing w:after="0" w:line="240"/>
+            </w:pPr>
+            <w:r>
+              <w:rPr>
+                <w:rFonts w:ascii="Calibri" w:cs="Calibri" w:eastAsia="Calibri" w:hAnsi="Calibri"/>
+                <w:b w:val="false"/>
+                <w:bCs w:val="false"/>
+                <w:sz w:val="15"/>
+                <w:szCs w:val="15"/>
+              </w:rPr>
+              <w:t xml:space="preserve">7.67:1</w:t>
+            </w:r>
+          </w:p>
+        </w:tc>
+        <w:tc>
+          <w:tcPr>
+            <w:tcW w:type="dxa" w:w="1635"/>
+            <w:tcBorders>
+              <w:top w:val="single" w:color="C8C8D0" w:sz="4"/>
+              <w:left w:val="single" w:color="C8C8D0" w:sz="4"/>
+              <w:bottom w:val="single" w:color="C8C8D0" w:sz="4"/>
+              <w:right w:val="single" w:color="C8C8D0" w:sz="4"/>
+            </w:tcBorders>
+            <w:tcMar>
+              <w:top w:type="dxa" w:w="40"/>
+              <w:left w:type="dxa" w:w="80"/>
+              <w:bottom w:type="dxa" w:w="40"/>
+              <w:right w:type="dxa" w:w="80"/>
+            </w:tcMar>
+            <w:vAlign w:val="top"/>
+          </w:tcPr>
+          <w:p>
+            <w:pPr>
+              <w:spacing w:after="0" w:line="240"/>
+            </w:pPr>
+            <w:r>
+              <w:rPr>
+                <w:rFonts w:ascii="Calibri" w:cs="Calibri" w:eastAsia="Calibri" w:hAnsi="Calibri"/>
+                <w:b w:val="false"/>
+                <w:bCs w:val="false"/>
+                <w:sz w:val="15"/>
+                <w:szCs w:val="15"/>
+              </w:rPr>
+              <w:t xml:space="preserve">Aprovado</w:t>
+            </w:r>
+          </w:p>
+        </w:tc>
+      </w:tr>
+      <w:tr>
+        <w:trPr>
+          <w:cantSplit/>
+        </w:trPr>
+        <w:tc>
+          <w:tcPr>
+            <w:tcW w:type="dxa" w:w="4897"/>
+            <w:tcBorders>
+              <w:top w:val="single" w:color="C8C8D0" w:sz="4"/>
+              <w:left w:val="single" w:color="C8C8D0" w:sz="4"/>
+              <w:bottom w:val="single" w:color="C8C8D0" w:sz="4"/>
+              <w:right w:val="single" w:color="C8C8D0" w:sz="4"/>
+            </w:tcBorders>
+            <w:tcMar>
+              <w:top w:type="dxa" w:w="40"/>
+              <w:left w:type="dxa" w:w="80"/>
+              <w:bottom w:type="dxa" w:w="40"/>
+              <w:right w:type="dxa" w:w="80"/>
+            </w:tcMar>
+            <w:vAlign w:val="top"/>
+          </w:tcPr>
+          <w:p>
+            <w:pPr>
+              <w:spacing w:after="0" w:line="240"/>
+            </w:pPr>
+            <w:r>
+              <w:rPr>
+                <w:rFonts w:ascii="Calibri" w:cs="Calibri" w:eastAsia="Calibri" w:hAnsi="Calibri"/>
+                <w:b w:val="false"/>
+                <w:bCs w:val="false"/>
+                <w:sz w:val="15"/>
+                <w:szCs w:val="15"/>
+              </w:rPr>
               <w:t xml:space="preserve">Botão SOS (pressed)</w:t>
             </w:r>
           </w:p>
@@ -8863,6 +9986,176 @@
                 <w:szCs w:val="15"/>
               </w:rPr>
               <w:t xml:space="preserve">9.11:1</w:t>
+            </w:r>
+          </w:p>
+        </w:tc>
+        <w:tc>
+          <w:tcPr>
+            <w:tcW w:type="dxa" w:w="1635"/>
+            <w:tcBorders>
+              <w:top w:val="single" w:color="C8C8D0" w:sz="4"/>
+              <w:left w:val="single" w:color="C8C8D0" w:sz="4"/>
+              <w:bottom w:val="single" w:color="C8C8D0" w:sz="4"/>
+              <w:right w:val="single" w:color="C8C8D0" w:sz="4"/>
+            </w:tcBorders>
+            <w:tcMar>
+              <w:top w:type="dxa" w:w="40"/>
+              <w:left w:type="dxa" w:w="80"/>
+              <w:bottom w:type="dxa" w:w="40"/>
+              <w:right w:type="dxa" w:w="80"/>
+            </w:tcMar>
+            <w:vAlign w:val="top"/>
+          </w:tcPr>
+          <w:p>
+            <w:pPr>
+              <w:spacing w:after="0" w:line="240"/>
+            </w:pPr>
+            <w:r>
+              <w:rPr>
+                <w:rFonts w:ascii="Calibri" w:cs="Calibri" w:eastAsia="Calibri" w:hAnsi="Calibri"/>
+                <w:b w:val="false"/>
+                <w:bCs w:val="false"/>
+                <w:sz w:val="15"/>
+                <w:szCs w:val="15"/>
+              </w:rPr>
+              <w:t xml:space="preserve">Aprovado</w:t>
+            </w:r>
+          </w:p>
+        </w:tc>
+      </w:tr>
+      <w:tr>
+        <w:trPr>
+          <w:cantSplit/>
+        </w:trPr>
+        <w:tc>
+          <w:tcPr>
+            <w:tcW w:type="dxa" w:w="4897"/>
+            <w:tcBorders>
+              <w:top w:val="single" w:color="C8C8D0" w:sz="4"/>
+              <w:left w:val="single" w:color="C8C8D0" w:sz="4"/>
+              <w:bottom w:val="single" w:color="C8C8D0" w:sz="4"/>
+              <w:right w:val="single" w:color="C8C8D0" w:sz="4"/>
+            </w:tcBorders>
+            <w:tcMar>
+              <w:top w:type="dxa" w:w="40"/>
+              <w:left w:type="dxa" w:w="80"/>
+              <w:bottom w:type="dxa" w:w="40"/>
+              <w:right w:type="dxa" w:w="80"/>
+            </w:tcMar>
+            <w:vAlign w:val="top"/>
+          </w:tcPr>
+          <w:p>
+            <w:pPr>
+              <w:spacing w:after="0" w:line="240"/>
+            </w:pPr>
+            <w:r>
+              <w:rPr>
+                <w:rFonts w:ascii="Calibri" w:cs="Calibri" w:eastAsia="Calibri" w:hAnsi="Calibri"/>
+                <w:b w:val="false"/>
+                <w:bCs w:val="false"/>
+                <w:sz w:val="15"/>
+                <w:szCs w:val="15"/>
+              </w:rPr>
+              <w:t xml:space="preserve">Botão secundário/ghost (hover, web)</w:t>
+            </w:r>
+          </w:p>
+        </w:tc>
+        <w:tc>
+          <w:tcPr>
+            <w:tcW w:type="dxa" w:w="1224"/>
+            <w:tcBorders>
+              <w:top w:val="single" w:color="C8C8D0" w:sz="4"/>
+              <w:left w:val="single" w:color="C8C8D0" w:sz="4"/>
+              <w:bottom w:val="single" w:color="C8C8D0" w:sz="4"/>
+              <w:right w:val="single" w:color="C8C8D0" w:sz="4"/>
+            </w:tcBorders>
+            <w:tcMar>
+              <w:top w:type="dxa" w:w="40"/>
+              <w:left w:type="dxa" w:w="80"/>
+              <w:bottom w:type="dxa" w:w="40"/>
+              <w:right w:type="dxa" w:w="80"/>
+            </w:tcMar>
+            <w:vAlign w:val="top"/>
+          </w:tcPr>
+          <w:p>
+            <w:pPr>
+              <w:spacing w:after="0" w:line="240"/>
+            </w:pPr>
+            <w:r>
+              <w:rPr>
+                <w:rFonts w:ascii="Calibri" w:cs="Calibri" w:eastAsia="Calibri" w:hAnsi="Calibri"/>
+                <w:b w:val="false"/>
+                <w:bCs w:val="false"/>
+                <w:sz w:val="15"/>
+                <w:szCs w:val="15"/>
+              </w:rPr>
+              <w:t xml:space="preserve">#7A3FC4</w:t>
+            </w:r>
+          </w:p>
+        </w:tc>
+        <w:tc>
+          <w:tcPr>
+            <w:tcW w:type="dxa" w:w="1224"/>
+            <w:tcBorders>
+              <w:top w:val="single" w:color="C8C8D0" w:sz="4"/>
+              <w:left w:val="single" w:color="C8C8D0" w:sz="4"/>
+              <w:bottom w:val="single" w:color="C8C8D0" w:sz="4"/>
+              <w:right w:val="single" w:color="C8C8D0" w:sz="4"/>
+            </w:tcBorders>
+            <w:tcMar>
+              <w:top w:type="dxa" w:w="40"/>
+              <w:left w:type="dxa" w:w="80"/>
+              <w:bottom w:type="dxa" w:w="40"/>
+              <w:right w:type="dxa" w:w="80"/>
+            </w:tcMar>
+            <w:vAlign w:val="top"/>
+          </w:tcPr>
+          <w:p>
+            <w:pPr>
+              <w:spacing w:after="0" w:line="240"/>
+            </w:pPr>
+            <w:r>
+              <w:rPr>
+                <w:rFonts w:ascii="Calibri" w:cs="Calibri" w:eastAsia="Calibri" w:hAnsi="Calibri"/>
+                <w:b w:val="false"/>
+                <w:bCs w:val="false"/>
+                <w:sz w:val="15"/>
+                <w:szCs w:val="15"/>
+              </w:rPr>
+              <w:t xml:space="preserve">#F4F4F6</w:t>
+            </w:r>
+          </w:p>
+        </w:tc>
+        <w:tc>
+          <w:tcPr>
+            <w:tcW w:type="dxa" w:w="1224"/>
+            <w:tcBorders>
+              <w:top w:val="single" w:color="C8C8D0" w:sz="4"/>
+              <w:left w:val="single" w:color="C8C8D0" w:sz="4"/>
+              <w:bottom w:val="single" w:color="C8C8D0" w:sz="4"/>
+              <w:right w:val="single" w:color="C8C8D0" w:sz="4"/>
+            </w:tcBorders>
+            <w:tcMar>
+              <w:top w:type="dxa" w:w="40"/>
+              <w:left w:type="dxa" w:w="80"/>
+              <w:bottom w:type="dxa" w:w="40"/>
+              <w:right w:type="dxa" w:w="80"/>
+            </w:tcMar>
+            <w:vAlign w:val="top"/>
+          </w:tcPr>
+          <w:p>
+            <w:pPr>
+              <w:spacing w:after="0" w:line="240"/>
+            </w:pPr>
+            <w:r>
+              <w:rPr>
+                <w:rFonts w:ascii="Calibri" w:cs="Calibri" w:eastAsia="Calibri" w:hAnsi="Calibri"/>
+                <w:b w:val="false"/>
+                <w:bCs w:val="false"/>
+                <w:sz w:val="15"/>
+                <w:szCs w:val="15"/>
+              </w:rPr>
+              <w:t xml:space="preserve">5.73:1</w:t>
             </w:r>
           </w:p>
         </w:tc>
@@ -19842,7 +21135,7 @@
           <w:sz w:val="19"/>
           <w:szCs w:val="19"/>
         </w:rPr>
-        <w:t xml:space="preserve">Cada problema da avaliação heurística recebeu uma correção na v2 (commit a11b51d, tag ux-av2-v2). A coluna "Correção aplicada" mostra o estado atual (v3, commit 6cf7d36, tag ux-av2-v3). "Corrigido (v3)" indica que a Iteração 2 mexeu na correção ou a reaplicou; "Revisado (v3)" indica que a solução mudou de forma, com o motivo na seção 5.1. As linhas TA-xx ficam reservadas para os achados do Think Aloud, a preencher depois das sessões.</w:t>
+        <w:t xml:space="preserve">Cada problema da avaliação heurística recebeu uma correção na v2 (commit a11b51d, tag ux-av2-v2). A coluna "Correção aplicada" mostra o estado atual (v3, commit b9d858a, tag ux-av2-v3). "Corrigido (v3)" indica que a Iteração 2 mexeu na correção ou a reaplicou; "Revisado (v3)" indica que a solução mudou de forma, com o motivo na seção 5.1. As linhas TA-xx ficam reservadas para os achados do Think Aloud, a preencher depois das sessões.</w:t>
       </w:r>
     </w:p>
     <w:tbl>
@@ -27878,6 +29171,176 @@
                 <w:szCs w:val="15"/>
               </w:rPr>
               <w:t xml:space="preserve">70b61b6, d74772e, 6cf7d36, bc7e947</w:t>
+            </w:r>
+          </w:p>
+        </w:tc>
+      </w:tr>
+      <w:tr>
+        <w:trPr>
+          <w:cantSplit/>
+        </w:trPr>
+        <w:tc>
+          <w:tcPr>
+            <w:tcW w:type="dxa" w:w="612"/>
+            <w:tcBorders>
+              <w:top w:val="single" w:color="C8C8D0" w:sz="4"/>
+              <w:left w:val="single" w:color="C8C8D0" w:sz="4"/>
+              <w:bottom w:val="single" w:color="C8C8D0" w:sz="4"/>
+              <w:right w:val="single" w:color="C8C8D0" w:sz="4"/>
+            </w:tcBorders>
+            <w:tcMar>
+              <w:top w:type="dxa" w:w="40"/>
+              <w:left w:type="dxa" w:w="80"/>
+              <w:bottom w:type="dxa" w:w="40"/>
+              <w:right w:type="dxa" w:w="80"/>
+            </w:tcMar>
+            <w:vAlign w:val="top"/>
+          </w:tcPr>
+          <w:p>
+            <w:pPr>
+              <w:spacing w:after="0" w:line="240"/>
+            </w:pPr>
+            <w:r>
+              <w:rPr>
+                <w:rFonts w:ascii="Calibri" w:cs="Calibri" w:eastAsia="Calibri" w:hAnsi="Calibri"/>
+                <w:b w:val="false"/>
+                <w:bCs w:val="false"/>
+                <w:sz w:val="15"/>
+                <w:szCs w:val="15"/>
+              </w:rPr>
+              <w:t xml:space="preserve">I2-12</w:t>
+            </w:r>
+          </w:p>
+        </w:tc>
+        <w:tc>
+          <w:tcPr>
+            <w:tcW w:type="dxa" w:w="3061"/>
+            <w:tcBorders>
+              <w:top w:val="single" w:color="C8C8D0" w:sz="4"/>
+              <w:left w:val="single" w:color="C8C8D0" w:sz="4"/>
+              <w:bottom w:val="single" w:color="C8C8D0" w:sz="4"/>
+              <w:right w:val="single" w:color="C8C8D0" w:sz="4"/>
+            </w:tcBorders>
+            <w:tcMar>
+              <w:top w:type="dxa" w:w="40"/>
+              <w:left w:type="dxa" w:w="80"/>
+              <w:bottom w:type="dxa" w:w="40"/>
+              <w:right w:type="dxa" w:w="80"/>
+            </w:tcMar>
+            <w:vAlign w:val="top"/>
+          </w:tcPr>
+          <w:p>
+            <w:pPr>
+              <w:spacing w:after="0" w:line="240"/>
+            </w:pPr>
+            <w:r>
+              <w:rPr>
+                <w:rFonts w:ascii="Calibri" w:cs="Calibri" w:eastAsia="Calibri" w:hAnsi="Calibri"/>
+                <w:b w:val="false"/>
+                <w:bCs w:val="false"/>
+                <w:sz w:val="15"/>
+                <w:szCs w:val="15"/>
+              </w:rPr>
+              <w:t xml:space="preserve">Estado hover nos botões (cor mais escura no primário e no perigo; fundo neutro no secundário e no ghost)</w:t>
+            </w:r>
+          </w:p>
+        </w:tc>
+        <w:tc>
+          <w:tcPr>
+            <w:tcW w:type="dxa" w:w="4081"/>
+            <w:tcBorders>
+              <w:top w:val="single" w:color="C8C8D0" w:sz="4"/>
+              <w:left w:val="single" w:color="C8C8D0" w:sz="4"/>
+              <w:bottom w:val="single" w:color="C8C8D0" w:sz="4"/>
+              <w:right w:val="single" w:color="C8C8D0" w:sz="4"/>
+            </w:tcBorders>
+            <w:tcMar>
+              <w:top w:type="dxa" w:w="40"/>
+              <w:left w:type="dxa" w:w="80"/>
+              <w:bottom w:type="dxa" w:w="40"/>
+              <w:right w:type="dxa" w:w="80"/>
+            </w:tcMar>
+            <w:vAlign w:val="top"/>
+          </w:tcPr>
+          <w:p>
+            <w:pPr>
+              <w:spacing w:after="0" w:line="240"/>
+            </w:pPr>
+            <w:r>
+              <w:rPr>
+                <w:rFonts w:ascii="Calibri" w:cs="Calibri" w:eastAsia="Calibri" w:hAnsi="Calibri"/>
+                <w:b w:val="false"/>
+                <w:bCs w:val="false"/>
+                <w:sz w:val="15"/>
+                <w:szCs w:val="15"/>
+              </w:rPr>
+              <w:t xml:space="preserve">O requisito pede estados default, hover e focus. No web, o botão não reagia ao ponteiro. Os 3 pares novos passam de 4.5:1.</w:t>
+            </w:r>
+          </w:p>
+        </w:tc>
+        <w:tc>
+          <w:tcPr>
+            <w:tcW w:type="dxa" w:w="816"/>
+            <w:tcBorders>
+              <w:top w:val="single" w:color="C8C8D0" w:sz="4"/>
+              <w:left w:val="single" w:color="C8C8D0" w:sz="4"/>
+              <w:bottom w:val="single" w:color="C8C8D0" w:sz="4"/>
+              <w:right w:val="single" w:color="C8C8D0" w:sz="4"/>
+            </w:tcBorders>
+            <w:tcMar>
+              <w:top w:type="dxa" w:w="40"/>
+              <w:left w:type="dxa" w:w="80"/>
+              <w:bottom w:type="dxa" w:w="40"/>
+              <w:right w:type="dxa" w:w="80"/>
+            </w:tcMar>
+            <w:vAlign w:val="top"/>
+          </w:tcPr>
+          <w:p>
+            <w:pPr>
+              <w:spacing w:after="0" w:line="240"/>
+            </w:pPr>
+            <w:r>
+              <w:rPr>
+                <w:rFonts w:ascii="Calibri" w:cs="Calibri" w:eastAsia="Calibri" w:hAnsi="Calibri"/>
+                <w:b w:val="false"/>
+                <w:bCs w:val="false"/>
+                <w:sz w:val="15"/>
+                <w:szCs w:val="15"/>
+              </w:rPr>
+              <w:t xml:space="preserve">H1</w:t>
+            </w:r>
+          </w:p>
+        </w:tc>
+        <w:tc>
+          <w:tcPr>
+            <w:tcW w:type="dxa" w:w="1634"/>
+            <w:tcBorders>
+              <w:top w:val="single" w:color="C8C8D0" w:sz="4"/>
+              <w:left w:val="single" w:color="C8C8D0" w:sz="4"/>
+              <w:bottom w:val="single" w:color="C8C8D0" w:sz="4"/>
+              <w:right w:val="single" w:color="C8C8D0" w:sz="4"/>
+            </w:tcBorders>
+            <w:tcMar>
+              <w:top w:type="dxa" w:w="40"/>
+              <w:left w:type="dxa" w:w="80"/>
+              <w:bottom w:type="dxa" w:w="40"/>
+              <w:right w:type="dxa" w:w="80"/>
+            </w:tcMar>
+            <w:vAlign w:val="top"/>
+          </w:tcPr>
+          <w:p>
+            <w:pPr>
+              <w:spacing w:after="0" w:line="240"/>
+            </w:pPr>
+            <w:r>
+              <w:rPr>
+                <w:rFonts w:ascii="Calibri" w:cs="Calibri" w:eastAsia="Calibri" w:hAnsi="Calibri"/>
+                <w:b w:val="false"/>
+                <w:bCs w:val="false"/>
+                <w:sz w:val="15"/>
+                <w:szCs w:val="15"/>
+              </w:rPr>
+              <w:t xml:space="preserve">30dfbd5, b9d858a</w:t>
             </w:r>
           </w:p>
         </w:tc>
@@ -35050,7 +36513,7 @@
           <w:sz w:val="19"/>
           <w:szCs w:val="19"/>
         </w:rPr>
-        <w:t xml:space="preserve">Contraste verificado por script, não a olho: 13 de 15 pares reprovavam na v1; os 25 pares de tokens passam na v2 e na v3, e as 6 combinações dos componentes restaurados também.</w:t>
+        <w:t xml:space="preserve">Contraste verificado por script, não a olho: 13 de 15 pares reprovavam na v1; os 25 pares de tokens da v2 e os 28 da v3 (com hover) passam, e as 6 combinações dos componentes restaurados também.</w:t>
       </w:r>
     </w:p>
     <w:p>
@@ -35633,7 +37096,7 @@
                 <w:sz w:val="15"/>
                 <w:szCs w:val="15"/>
               </w:rPr>
-              <w:t xml:space="preserve">Estados de botão default / pressed / focus</w:t>
+              <w:t xml:space="preserve">Estados de botão default / hover / focus</w:t>
             </w:r>
           </w:p>
         </w:tc>
@@ -35666,7 +37129,7 @@
                 <w:sz w:val="15"/>
                 <w:szCs w:val="15"/>
               </w:rPr>
-              <w:t xml:space="preserve">Button.tsx; /design-system → Button (4 variantes × 5 estados)</w:t>
+              <w:t xml:space="preserve">Button.tsx; /design-system → Button (4 variantes × 6 estados: default, hover, pressed, focus, disabled, loading)</w:t>
             </w:r>
           </w:p>
         </w:tc>
@@ -35978,7 +37441,7 @@
                 <w:sz w:val="15"/>
                 <w:szCs w:val="15"/>
               </w:rPr>
-              <w:t xml:space="preserve">tokens.ts; check-contrast.ts (25/25 na v3) + 6 combinações dos componentes restaurados; seção 2</w:t>
+              <w:t xml:space="preserve">tokens.ts; check-contrast.ts (28/28 na v3) + 6 combinações dos componentes restaurados; seção 2</w:t>
             </w:r>
           </w:p>
         </w:tc>
@@ -36082,7 +37545,7 @@
                 <w:sz w:val="15"/>
                 <w:szCs w:val="15"/>
               </w:rPr>
-              <w:t xml:space="preserve">Montserrat carregada; escala de 8; check-hardcoded.ts: 0 ocorrências na v2, 49 na v3 restritas aos componentes restaurados (PD-02)</w:t>
+              <w:t xml:space="preserve">Montserrat carregada; escala de 8; grid de coluna única com margem de 16 e largura máxima de 560; check-hardcoded.ts: 0 ocorrências na v2, 49 na v3 restritas aos componentes restaurados (PD-02)</w:t>
             </w:r>
           </w:p>
         </w:tc>
@@ -40554,7 +42017,7 @@
                 <w:sz w:val="15"/>
                 <w:szCs w:val="15"/>
               </w:rPr>
-              <w:t xml:space="preserve">v1 · Lazer: seções vazias sem aviso (P08)</w:t>
+              <w:t xml:space="preserve">Hover na vitrine de botões</w:t>
             </w:r>
           </w:p>
         </w:tc>
@@ -40632,7 +42095,7 @@
                 <w:sz w:val="15"/>
                 <w:szCs w:val="15"/>
               </w:rPr>
-              <w:t xml:space="preserve">v1 · Livros: "nenhum livro" no erro (P09)</w:t>
+              <w:t xml:space="preserve">Hover no "Entrar" (web)</w:t>
             </w:r>
           </w:p>
         </w:tc>
@@ -40710,7 +42173,7 @@
                 <w:sz w:val="15"/>
                 <w:szCs w:val="15"/>
               </w:rPr>
-              <w:t xml:space="preserve">v1 · Diário: erro + "nenhuma entrada" (P10)</w:t>
+              <w:t xml:space="preserve">v1 · Lazer: seções vazias sem aviso (P08)</w:t>
             </w:r>
           </w:p>
         </w:tc>
@@ -40730,7 +42193,67 @@
               <w:right w:type="dxa" w:w="40"/>
             </w:tcMar>
           </w:tcPr>
-          <w:p/>
+          <w:p>
+            <w:pPr>
+              <w:spacing w:after="20"/>
+              <w:jc w:val="center"/>
+            </w:pPr>
+            <w:r>
+              <w:drawing>
+                <wp:inline distT="0" distB="0" distL="0" distR="0">
+                  <wp:extent cx="1143000" cy="2476500"/>
+                  <wp:effectExtent t="0" r="0" b="0" l="0"/>
+                  <wp:docPr id="50" name="" descr="" title=""/>
+                  <wp:cNvGraphicFramePr>
+                    <a:graphicFrameLocks xmlns:a="http://schemas.openxmlformats.org/drawingml/2006/main" noChangeAspect="1"/>
+                  </wp:cNvGraphicFramePr>
+                  <a:graphic xmlns:a="http://schemas.openxmlformats.org/drawingml/2006/main">
+                    <a:graphicData uri="http://schemas.openxmlformats.org/drawingml/2006/picture">
+                      <pic:pic xmlns:pic="http://schemas.openxmlformats.org/drawingml/2006/picture">
+                        <pic:nvPicPr>
+                          <pic:cNvPr id="0" name="" descr=""/>
+                          <pic:cNvPicPr>
+                            <a:picLocks noChangeAspect="1" noChangeArrowheads="1"/>
+                          </pic:cNvPicPr>
+                        </pic:nvPicPr>
+                        <pic:blipFill>
+                          <a:blip r:embed="rId50" cstate="none"/>
+                          <a:srcRect/>
+                          <a:stretch>
+                            <a:fillRect/>
+                          </a:stretch>
+                        </pic:blipFill>
+                        <pic:spPr bwMode="auto">
+                          <a:xfrm>
+                            <a:off x="0" y="0"/>
+                            <a:ext cx="1143000" cy="2476500"/>
+                          </a:xfrm>
+                          <a:prstGeom prst="rect">
+                            <a:avLst/>
+                          </a:prstGeom>
+                        </pic:spPr>
+                      </pic:pic>
+                    </a:graphicData>
+                  </a:graphic>
+                </wp:inline>
+              </w:drawing>
+            </w:r>
+          </w:p>
+          <w:p>
+            <w:pPr>
+              <w:spacing w:after="0"/>
+              <w:jc w:val="center"/>
+            </w:pPr>
+            <w:r>
+              <w:rPr>
+                <w:rFonts w:ascii="Calibri" w:cs="Calibri" w:eastAsia="Calibri" w:hAnsi="Calibri"/>
+                <w:color w:val="575760"/>
+                <w:sz w:val="15"/>
+                <w:szCs w:val="15"/>
+              </w:rPr>
+              <w:t xml:space="preserve">v1 · Livros: "nenhum livro" no erro (P09)</w:t>
+            </w:r>
+          </w:p>
         </w:tc>
         <w:tc>
           <w:tcPr>
@@ -40748,7 +42271,67 @@
               <w:right w:type="dxa" w:w="40"/>
             </w:tcMar>
           </w:tcPr>
-          <w:p/>
+          <w:p>
+            <w:pPr>
+              <w:spacing w:after="20"/>
+              <w:jc w:val="center"/>
+            </w:pPr>
+            <w:r>
+              <w:drawing>
+                <wp:inline distT="0" distB="0" distL="0" distR="0">
+                  <wp:extent cx="1143000" cy="2476500"/>
+                  <wp:effectExtent t="0" r="0" b="0" l="0"/>
+                  <wp:docPr id="51" name="" descr="" title=""/>
+                  <wp:cNvGraphicFramePr>
+                    <a:graphicFrameLocks xmlns:a="http://schemas.openxmlformats.org/drawingml/2006/main" noChangeAspect="1"/>
+                  </wp:cNvGraphicFramePr>
+                  <a:graphic xmlns:a="http://schemas.openxmlformats.org/drawingml/2006/main">
+                    <a:graphicData uri="http://schemas.openxmlformats.org/drawingml/2006/picture">
+                      <pic:pic xmlns:pic="http://schemas.openxmlformats.org/drawingml/2006/picture">
+                        <pic:nvPicPr>
+                          <pic:cNvPr id="0" name="" descr=""/>
+                          <pic:cNvPicPr>
+                            <a:picLocks noChangeAspect="1" noChangeArrowheads="1"/>
+                          </pic:cNvPicPr>
+                        </pic:nvPicPr>
+                        <pic:blipFill>
+                          <a:blip r:embed="rId51" cstate="none"/>
+                          <a:srcRect/>
+                          <a:stretch>
+                            <a:fillRect/>
+                          </a:stretch>
+                        </pic:blipFill>
+                        <pic:spPr bwMode="auto">
+                          <a:xfrm>
+                            <a:off x="0" y="0"/>
+                            <a:ext cx="1143000" cy="2476500"/>
+                          </a:xfrm>
+                          <a:prstGeom prst="rect">
+                            <a:avLst/>
+                          </a:prstGeom>
+                        </pic:spPr>
+                      </pic:pic>
+                    </a:graphicData>
+                  </a:graphic>
+                </wp:inline>
+              </w:drawing>
+            </w:r>
+          </w:p>
+          <w:p>
+            <w:pPr>
+              <w:spacing w:after="0"/>
+              <w:jc w:val="center"/>
+            </w:pPr>
+            <w:r>
+              <w:rPr>
+                <w:rFonts w:ascii="Calibri" w:cs="Calibri" w:eastAsia="Calibri" w:hAnsi="Calibri"/>
+                <w:color w:val="575760"/>
+                <w:sz w:val="15"/>
+                <w:szCs w:val="15"/>
+              </w:rPr>
+              <w:t xml:space="preserve">v1 · Diário: erro + "nenhuma entrada" (P10)</w:t>
+            </w:r>
+          </w:p>
         </w:tc>
       </w:tr>
     </w:tbl>

</xml_diff>

<commit_message>
📚 docs(mobile): recapture av2 prints with gradient
Co-Authored-By: Claude Opus 5.5 <noreply@anthropic.com>
</commit_message>
<xml_diff>
--- a/docs/av2-oncomente.docx
+++ b/docs/av2-oncomente.docx
@@ -43,7 +43,7 @@
           <w:sz w:val="16"/>
           <w:szCs w:val="16"/>
         </w:rPr>
-        <w:t xml:space="preserve">Branch ux-av2 · v1 = commit 92e5d3c (tag ux-av2-v1) · v2 = commit a11b51d (tag ux-av2-v2) · v3 (atual) = commit b9d858a (tag ux-av2-v3)</w:t>
+        <w:t xml:space="preserve">Branch ux-av2 · v1 = commit 92e5d3c (tag ux-av2-v1) · v2 = commit a11b51d (tag ux-av2-v2) · v3 (atual) = commit bf9e5d5 (tag ux-av2-v3)</w:t>
       </w:r>
     </w:p>
     <w:p>
@@ -4490,7 +4490,7 @@
           <w:sz w:val="19"/>
           <w:szCs w:val="19"/>
         </w:rPr>
-        <w:t xml:space="preserve">Script: npx tsx apps/mobile/scripts/check-contrast.ts. Ele calcula (L1 + 0.05) / (L2 + 0.05) para todos os pares registrados em tokens.ts e falha se algum ficar abaixo de 4.5:1. Resultado na v1: 13 de 15 pares reprovados. Na v2: 25 de 25 aprovados. Na v3, com os 3 pares de hover: 28 de 28 aprovados.</w:t>
+        <w:t xml:space="preserve">Script: npx tsx apps/mobile/scripts/check-contrast.ts. Ele calcula (L1 + 0.05) / (L2 + 0.05) para todos os pares registrados em tokens.ts e falha se algum ficar abaixo de 4.5:1. Resultado na v1: 13 de 15 pares reprovados. Na v2: 25 de 25 aprovados. Na v3, com os 3 pares de hover: 28 de 28 aprovados. Na v3 o par do header sobre o degradê passou a usar o lilás real do topo (#D78FEE): o token antigo apontava para um lilás mais claro e aprovava um par que, na tela, ficava em 2.65:1.</w:t>
       </w:r>
     </w:p>
     <w:p>
@@ -8186,7 +8186,7 @@
                 <w:sz w:val="15"/>
                 <w:szCs w:val="15"/>
               </w:rPr>
-              <w:t xml:space="preserve">Header do Início sobre o gradiente</w:t>
+              <w:t xml:space="preserve">Logo e título de header sobre o degradê</w:t>
             </w:r>
           </w:p>
         </w:tc>
@@ -8219,7 +8219,7 @@
                 <w:sz w:val="15"/>
                 <w:szCs w:val="15"/>
               </w:rPr>
-              <w:t xml:space="preserve">#4E56C0</w:t>
+              <w:t xml:space="preserve">#3F1F73</w:t>
             </w:r>
           </w:p>
         </w:tc>
@@ -8252,7 +8252,7 @@
                 <w:sz w:val="15"/>
                 <w:szCs w:val="15"/>
               </w:rPr>
-              <w:t xml:space="preserve">#EEE3FB</w:t>
+              <w:t xml:space="preserve">#D78FEE</w:t>
             </w:r>
           </w:p>
         </w:tc>
@@ -8285,7 +8285,7 @@
                 <w:sz w:val="15"/>
                 <w:szCs w:val="15"/>
               </w:rPr>
-              <w:t xml:space="preserve">4.98:1</w:t>
+              <w:t xml:space="preserve">5.47:1</w:t>
             </w:r>
           </w:p>
         </w:tc>
@@ -8422,7 +8422,7 @@
                 <w:sz w:val="15"/>
                 <w:szCs w:val="15"/>
               </w:rPr>
-              <w:t xml:space="preserve">#EEE3FB</w:t>
+              <w:t xml:space="preserve">#D78FEE</w:t>
             </w:r>
           </w:p>
         </w:tc>
@@ -8455,7 +8455,7 @@
                 <w:sz w:val="15"/>
                 <w:szCs w:val="15"/>
               </w:rPr>
-              <w:t xml:space="preserve">14.10:1</w:t>
+              <w:t xml:space="preserve">7.50:1</w:t>
             </w:r>
           </w:p>
         </w:tc>
@@ -12485,7 +12485,7 @@
                 <w:sz w:val="15"/>
                 <w:szCs w:val="15"/>
               </w:rPr>
-              <w:t xml:space="preserve">Logo ONCOMENTE (HeaderLogo)</w:t>
+              <w:t xml:space="preserve">Logo ONCOMENTE (HeaderLogo) sobre o degradê</w:t>
             </w:r>
           </w:p>
         </w:tc>
@@ -12518,7 +12518,7 @@
                 <w:sz w:val="15"/>
                 <w:szCs w:val="15"/>
               </w:rPr>
-              <w:t xml:space="preserve">#4E56C0</w:t>
+              <w:t xml:space="preserve">#3F1F73</w:t>
             </w:r>
           </w:p>
         </w:tc>
@@ -12551,7 +12551,7 @@
                 <w:sz w:val="15"/>
                 <w:szCs w:val="15"/>
               </w:rPr>
-              <w:t xml:space="preserve">#FFFFFF</w:t>
+              <w:t xml:space="preserve">#D78FEE</w:t>
             </w:r>
           </w:p>
         </w:tc>
@@ -12584,7 +12584,7 @@
                 <w:sz w:val="15"/>
                 <w:szCs w:val="15"/>
               </w:rPr>
-              <w:t xml:space="preserve">6.15:1</w:t>
+              <w:t xml:space="preserve">5.47:1</w:t>
             </w:r>
           </w:p>
         </w:tc>
@@ -21135,7 +21135,7 @@
           <w:sz w:val="19"/>
           <w:szCs w:val="19"/>
         </w:rPr>
-        <w:t xml:space="preserve">Cada problema da avaliação heurística recebeu uma correção na v2 (commit a11b51d, tag ux-av2-v2). A coluna "Correção aplicada" mostra o estado atual (v3, commit b9d858a, tag ux-av2-v3). "Corrigido (v3)" indica que a Iteração 2 mexeu na correção ou a reaplicou; "Revisado (v3)" indica que a solução mudou de forma, com o motivo na seção 5.1. As linhas TA-xx ficam reservadas para os achados do Think Aloud, a preencher depois das sessões.</w:t>
+        <w:t xml:space="preserve">Cada problema da avaliação heurística recebeu uma correção na v2 (commit a11b51d, tag ux-av2-v2). A coluna "Correção aplicada" mostra o estado atual (v3, commit bf9e5d5, tag ux-av2-v3). "Corrigido (v3)" indica que a Iteração 2 mexeu na correção ou a reaplicou; "Revisado (v3)" indica que a solução mudou de forma, com o motivo na seção 5.1. As linhas TA-xx ficam reservadas para os achados do Think Aloud, a preencher depois das sessões.</w:t>
       </w:r>
     </w:p>
     <w:tbl>
@@ -22519,7 +22519,7 @@
                 <w:sz w:val="15"/>
                 <w:szCs w:val="15"/>
               </w:rPr>
-              <w:t xml:space="preserve">Logo em text.brand (6.15:1). O atalho de long-press para o Design System saiu com a Home restaurada; a tela continua na rota /design-system.</w:t>
+              <w:t xml:space="preserve">Logo em #3F1F73 sobre o topo lilás do degradê (5.47:1); o título "Início" usa a mesma cor. O atalho de long-press para o Design System saiu com a Home restaurada; a tela continua na rota /design-system.</w:t>
             </w:r>
           </w:p>
         </w:tc>
@@ -29341,6 +29341,176 @@
                 <w:szCs w:val="15"/>
               </w:rPr>
               <w:t xml:space="preserve">30dfbd5, b9d858a</w:t>
+            </w:r>
+          </w:p>
+        </w:tc>
+      </w:tr>
+      <w:tr>
+        <w:trPr>
+          <w:cantSplit/>
+        </w:trPr>
+        <w:tc>
+          <w:tcPr>
+            <w:tcW w:type="dxa" w:w="612"/>
+            <w:tcBorders>
+              <w:top w:val="single" w:color="C8C8D0" w:sz="4"/>
+              <w:left w:val="single" w:color="C8C8D0" w:sz="4"/>
+              <w:bottom w:val="single" w:color="C8C8D0" w:sz="4"/>
+              <w:right w:val="single" w:color="C8C8D0" w:sz="4"/>
+            </w:tcBorders>
+            <w:tcMar>
+              <w:top w:type="dxa" w:w="40"/>
+              <w:left w:type="dxa" w:w="80"/>
+              <w:bottom w:type="dxa" w:w="40"/>
+              <w:right w:type="dxa" w:w="80"/>
+            </w:tcMar>
+            <w:vAlign w:val="top"/>
+          </w:tcPr>
+          <w:p>
+            <w:pPr>
+              <w:spacing w:after="0" w:line="240"/>
+            </w:pPr>
+            <w:r>
+              <w:rPr>
+                <w:rFonts w:ascii="Calibri" w:cs="Calibri" w:eastAsia="Calibri" w:hAnsi="Calibri"/>
+                <w:b w:val="false"/>
+                <w:bCs w:val="false"/>
+                <w:sz w:val="15"/>
+                <w:szCs w:val="15"/>
+              </w:rPr>
+              <w:t xml:space="preserve">I2-13</w:t>
+            </w:r>
+          </w:p>
+        </w:tc>
+        <w:tc>
+          <w:tcPr>
+            <w:tcW w:type="dxa" w:w="3061"/>
+            <w:tcBorders>
+              <w:top w:val="single" w:color="C8C8D0" w:sz="4"/>
+              <w:left w:val="single" w:color="C8C8D0" w:sz="4"/>
+              <w:bottom w:val="single" w:color="C8C8D0" w:sz="4"/>
+              <w:right w:val="single" w:color="C8C8D0" w:sz="4"/>
+            </w:tcBorders>
+            <w:tcMar>
+              <w:top w:type="dxa" w:w="40"/>
+              <w:left w:type="dxa" w:w="80"/>
+              <w:bottom w:type="dxa" w:w="40"/>
+              <w:right w:type="dxa" w:w="80"/>
+            </w:tcMar>
+            <w:vAlign w:val="top"/>
+          </w:tcPr>
+          <w:p>
+            <w:pPr>
+              <w:spacing w:after="0" w:line="240"/>
+            </w:pPr>
+            <w:r>
+              <w:rPr>
+                <w:rFonts w:ascii="Calibri" w:cs="Calibri" w:eastAsia="Calibri" w:hAnsi="Calibri"/>
+                <w:b w:val="false"/>
+                <w:bCs w:val="false"/>
+                <w:sz w:val="15"/>
+                <w:szCs w:val="15"/>
+              </w:rPr>
+              <w:t xml:space="preserve">Fundo em degradê também no web; logo e títulos sobre o degradê em #3F1F73</w:t>
+            </w:r>
+          </w:p>
+        </w:tc>
+        <w:tc>
+          <w:tcPr>
+            <w:tcW w:type="dxa" w:w="4081"/>
+            <w:tcBorders>
+              <w:top w:val="single" w:color="C8C8D0" w:sz="4"/>
+              <w:left w:val="single" w:color="C8C8D0" w:sz="4"/>
+              <w:bottom w:val="single" w:color="C8C8D0" w:sz="4"/>
+              <w:right w:val="single" w:color="C8C8D0" w:sz="4"/>
+            </w:tcBorders>
+            <w:tcMar>
+              <w:top w:type="dxa" w:w="40"/>
+              <w:left w:type="dxa" w:w="80"/>
+              <w:bottom w:type="dxa" w:w="40"/>
+              <w:right w:type="dxa" w:w="80"/>
+            </w:tcMar>
+            <w:vAlign w:val="top"/>
+          </w:tcPr>
+          <w:p>
+            <w:pPr>
+              <w:spacing w:after="0" w:line="240"/>
+            </w:pPr>
+            <w:r>
+              <w:rPr>
+                <w:rFonts w:ascii="Calibri" w:cs="Calibri" w:eastAsia="Calibri" w:hAnsi="Calibri"/>
+                <w:b w:val="false"/>
+                <w:bCs w:val="false"/>
+                <w:sz w:val="15"/>
+                <w:szCs w:val="15"/>
+              </w:rPr>
+              <w:t xml:space="preserve">No web, o tema padrão da navegação pintava #F2F2F2 por cima do degradê do app. Ao corrigir, apareceu que o logo e os títulos do header ficavam em 2.65:1 sobre o lilás do topo. O token gradientTop passou a ser o lilás real, e o script de contraste mede o par verdadeiro (5.47:1).</w:t>
+            </w:r>
+          </w:p>
+        </w:tc>
+        <w:tc>
+          <w:tcPr>
+            <w:tcW w:type="dxa" w:w="816"/>
+            <w:tcBorders>
+              <w:top w:val="single" w:color="C8C8D0" w:sz="4"/>
+              <w:left w:val="single" w:color="C8C8D0" w:sz="4"/>
+              <w:bottom w:val="single" w:color="C8C8D0" w:sz="4"/>
+              <w:right w:val="single" w:color="C8C8D0" w:sz="4"/>
+            </w:tcBorders>
+            <w:tcMar>
+              <w:top w:type="dxa" w:w="40"/>
+              <w:left w:type="dxa" w:w="80"/>
+              <w:bottom w:type="dxa" w:w="40"/>
+              <w:right w:type="dxa" w:w="80"/>
+            </w:tcMar>
+            <w:vAlign w:val="top"/>
+          </w:tcPr>
+          <w:p>
+            <w:pPr>
+              <w:spacing w:after="0" w:line="240"/>
+            </w:pPr>
+            <w:r>
+              <w:rPr>
+                <w:rFonts w:ascii="Calibri" w:cs="Calibri" w:eastAsia="Calibri" w:hAnsi="Calibri"/>
+                <w:b w:val="false"/>
+                <w:bCs w:val="false"/>
+                <w:sz w:val="15"/>
+                <w:szCs w:val="15"/>
+              </w:rPr>
+              <w:t xml:space="preserve">H4, H8</w:t>
+            </w:r>
+          </w:p>
+        </w:tc>
+        <w:tc>
+          <w:tcPr>
+            <w:tcW w:type="dxa" w:w="1634"/>
+            <w:tcBorders>
+              <w:top w:val="single" w:color="C8C8D0" w:sz="4"/>
+              <w:left w:val="single" w:color="C8C8D0" w:sz="4"/>
+              <w:bottom w:val="single" w:color="C8C8D0" w:sz="4"/>
+              <w:right w:val="single" w:color="C8C8D0" w:sz="4"/>
+            </w:tcBorders>
+            <w:tcMar>
+              <w:top w:type="dxa" w:w="40"/>
+              <w:left w:type="dxa" w:w="80"/>
+              <w:bottom w:type="dxa" w:w="40"/>
+              <w:right w:type="dxa" w:w="80"/>
+            </w:tcMar>
+            <w:vAlign w:val="top"/>
+          </w:tcPr>
+          <w:p>
+            <w:pPr>
+              <w:spacing w:after="0" w:line="240"/>
+            </w:pPr>
+            <w:r>
+              <w:rPr>
+                <w:rFonts w:ascii="Calibri" w:cs="Calibri" w:eastAsia="Calibri" w:hAnsi="Calibri"/>
+                <w:b w:val="false"/>
+                <w:bCs w:val="false"/>
+                <w:sz w:val="15"/>
+                <w:szCs w:val="15"/>
+              </w:rPr>
+              <w:t xml:space="preserve">6e2d6f8, bf9e5d5</w:t>
             </w:r>
           </w:p>
         </w:tc>
@@ -38202,7 +38372,7 @@
           <w:sz w:val="19"/>
           <w:szCs w:val="19"/>
         </w:rPr>
-        <w:t xml:space="preserve">Capturados automaticamente (apps/mobile/scripts/capture-screens.mjs, Expo Web + Playwright, 390×844). "Antes" é a v1 e "depois" é a versão atual (v3). No web, o fundo das telas sai cinza claro em vez do gradiente lilás do app nativo.</w:t>
+        <w:t xml:space="preserve">Capturados automaticamente (apps/mobile/scripts/capture-screens.mjs, Expo Web + Playwright, 390×844). "Antes" é a v1 e "depois" é a versão atual (v3). Os prints da v1 e da v2 saíram com fundo cinza claro, porque o tema da navegação cobria o degradê no web. Os da v3 mostram o degradê lilás, como no app (I2-13).</w:t>
       </w:r>
     </w:p>
     <w:tbl>

</xml_diff>